<commit_message>
Improve Word version of the project summary
</commit_message>
<xml_diff>
--- a/PROJECT_SUMMARY.docx
+++ b/PROJECT_SUMMARY.docx
@@ -28,52 +28,26 @@
     </w:p>
     <w:p>
       <w:r>
-        <w:t>CyberNews is a website that puts cybersecurity news in one place. When you open it you see a dashboard</w:t>
+        <w:t>CyberNews is a website that puts cybersecurity news in one place. When you open it you see a dashboard with three featured stories, a grid of article cards, and a list of categories. You can search and filter the news by category, source and date, and the results change straight away without the page reloading. You can click any card to read the full article page.</w:t>
       </w:r>
     </w:p>
     <w:p>
       <w:r>
-        <w:t>with three featured stories, a grid of article cards, and a list of categories. You can search and filter</w:t>
+        <w:t>If you make an account, you can bookmark articles and find them again on "My bookmarks". If you are the admin, you also get an admin dashboard where you can add, edit and delete articles, import real headlines from The Hacker News RSS feed, read contact messages, and look at a login audit log.</w:t>
       </w:r>
     </w:p>
     <w:p>
       <w:r>
-        <w:t>the news by category, source and date, and the results change straight away without the page reloading.</w:t>
+        <w:t xml:space="preserve">To be honest about the content: the 12 articles that come with the project are </w:t>
       </w:r>
-    </w:p>
-    <w:p>
       <w:r>
-        <w:t>You can click any card to read the full article page.</w:t>
+        <w:rPr>
+          <w:b/>
+        </w:rPr>
+        <w:t>sample stories I wrote myself</w:t>
       </w:r>
-    </w:p>
-    <w:p>
       <w:r>
-        <w:t>If you make an account, you can bookmark articles and find them again on "My bookmarks".</w:t>
-      </w:r>
-    </w:p>
-    <w:p>
-      <w:r>
-        <w:t>If you are the admin, you also get an admin dashboard where you can add, edit and delete articles,</w:t>
-      </w:r>
-    </w:p>
-    <w:p>
-      <w:r>
-        <w:t>import real headlines from The Hacker News RSS feed, read contact messages, and look at a login audit log.</w:t>
-      </w:r>
-    </w:p>
-    <w:p>
-      <w:r>
-        <w:t>To be honest about the content: the 12 articles that come with the project are **sample stories I wrote</w:t>
-      </w:r>
-    </w:p>
-    <w:p>
-      <w:r>
-        <w:t>myself** with made-up companies (Contoso, Northwind, Fabrikam). They have a yellow "Sample" badge, and the</w:t>
-      </w:r>
-    </w:p>
-    <w:p>
-      <w:r>
-        <w:t>source links only go to the news sites' home pages. The real headlines come in with the RSS import button.</w:t>
+        <w:t xml:space="preserve"> with made-up companies (Contoso, Northwind, Fabrikam). They have a yellow "Sample" badge, and the source links only go to the news sites' home pages. The real headlines come in with the RSS import button.</w:t>
       </w:r>
     </w:p>
     <w:p>
@@ -547,31 +521,6 @@
     </w:p>
     <w:p>
       <w:r>
-        <w:rPr>
-          <w:rFonts w:ascii="Consolas" w:hAnsi="Consolas"/>
-          <w:sz w:val="15"/>
-        </w:rPr>
-        <w:t xml:space="preserve">   FRONTEND (browser)            BACKEND (Flask)                 DATABASE (SQLite)</w:t>
-        <w:br/>
-        <w:t xml:space="preserve"> ┌──────────────────────┐     ┌──────────────────────────┐     ┌──────────────────┐</w:t>
-        <w:br/>
-        <w:t xml:space="preserve"> │ HTML from templates  │ --&gt; │ routes in web_app.py     │ --&gt; │ cybernews.db     │</w:t>
-        <w:br/>
-        <w:t xml:space="preserve"> │ style.css            │ HTTP│ sessions + roles         │ SQL │  users           │</w:t>
-        <w:br/>
-        <w:t xml:space="preserve"> │ app.js  (fetch)      │ &lt;-- │ CSRF, hashing, checks    │ &lt;-- │  articles        │</w:t>
-        <w:br/>
-        <w:t xml:space="preserve"> │ forms + csrf_token   │HTML/│ /api/articles -&gt; JSON    │rows │  bookmarks       │</w:t>
-        <w:br/>
-        <w:t xml:space="preserve"> └──────────────────────┘JSON └──────────────────────────┘     │  login_audit     │</w:t>
-        <w:br/>
-        <w:t xml:space="preserve">                                                               │  messages        │</w:t>
-        <w:br/>
-        <w:t xml:space="preserve">                                                               └──────────────────┘</w:t>
-      </w:r>
-    </w:p>
-    <w:p>
-      <w:r>
         <w:t xml:space="preserve">In simple words: the </w:t>
       </w:r>
       <w:r>
@@ -590,12 +539,7 @@
         <w:t>Flask</w:t>
       </w:r>
       <w:r>
-        <w:t xml:space="preserve"> finds the right route, checks who you are</w:t>
-      </w:r>
-    </w:p>
-    <w:p>
-      <w:r>
-        <w:t xml:space="preserve">(session) and what you are allowed to do (role), asks the </w:t>
+        <w:t xml:space="preserve"> finds the right route, checks who you are (session) and what you are allowed to do (role), asks the </w:t>
       </w:r>
       <w:r>
         <w:rPr>
@@ -604,12 +548,7 @@
         <w:t>database</w:t>
       </w:r>
       <w:r>
-        <w:t xml:space="preserve"> for the data with a safe SQL query,</w:t>
-      </w:r>
-    </w:p>
-    <w:p>
-      <w:r>
-        <w:t xml:space="preserve">and puts the data into a </w:t>
+        <w:t xml:space="preserve"> for the data with a safe SQL query, and puts the data into a </w:t>
       </w:r>
       <w:r>
         <w:rPr>
@@ -628,12 +567,7 @@
         <w:t>app.js</w:t>
       </w:r>
       <w:r>
-        <w:t xml:space="preserve"> asks for JSON</w:t>
-      </w:r>
-    </w:p>
-    <w:p>
-      <w:r>
-        <w:t>instead of HTML and builds the cards itself.</w:t>
+        <w:t xml:space="preserve"> asks for JSON instead of HTML and builds the cards itself.</w:t>
       </w:r>
     </w:p>
     <w:p>
@@ -733,12 +667,7 @@
         <w:t>innerHTML</w:t>
       </w:r>
       <w:r>
-        <w:t>,</w:t>
-      </w:r>
-    </w:p>
-    <w:p>
-      <w:r>
-        <w:t xml:space="preserve">  and article links must start with </w:t>
+        <w:t xml:space="preserve">, and article links must start with </w:t>
       </w:r>
       <w:r>
         <w:rPr>
@@ -895,12 +824,7 @@
         <w:t>Sessions and roles.</w:t>
       </w:r>
       <w:r>
-        <w:t xml:space="preserve"> Hiding the Admin link from normal users is easy, but I learned that hiding a link</w:t>
-      </w:r>
-    </w:p>
-    <w:p>
-      <w:r>
-        <w:t xml:space="preserve">  is not security, because anyone can type </w:t>
+        <w:t xml:space="preserve"> Hiding the Admin link from normal users is easy, but I learned that hiding a link is not security, because anyone can type </w:t>
       </w:r>
       <w:r>
         <w:rPr>
@@ -910,12 +834,7 @@
         <w:t>/admin</w:t>
       </w:r>
       <w:r>
-        <w:t xml:space="preserve"> in the address bar. The real check has to be on the</w:t>
-      </w:r>
-    </w:p>
-    <w:p>
-      <w:r>
-        <w:t xml:space="preserve">  server, so I wrote the </w:t>
+        <w:t xml:space="preserve"> in the address bar. The real check has to be on the server, so I wrote the </w:t>
       </w:r>
       <w:r>
         <w:rPr>
@@ -939,17 +858,7 @@
         <w:t>CSRF tokens.</w:t>
       </w:r>
       <w:r>
-        <w:t xml:space="preserve"> With CSRFProtect switched on, every POST form needs the hidden token, including small</w:t>
-      </w:r>
-    </w:p>
-    <w:p>
-      <w:r>
-        <w:t xml:space="preserve">  ones like Log out, Bookmark and Delete. I also had to switch CSRF on in the right order, so the</w:t>
-      </w:r>
-    </w:p>
-    <w:p>
-      <w:r>
-        <w:t xml:space="preserve">  "security check failed" page still shows who is logged in.</w:t>
+        <w:t xml:space="preserve"> With CSRFProtect switched on, every POST form needs the hidden token, including small ones like Log out, Bookmark and Delete. I also had to switch CSRF on in the right order, so the "security check failed" page still shows who is logged in.</w:t>
       </w:r>
     </w:p>
     <w:p>
@@ -963,12 +872,7 @@
         <w:t>Jinja macros.</w:t>
       </w:r>
       <w:r>
-        <w:t xml:space="preserve"> My filter drop-downs were empty because imported macros don't see template variables</w:t>
-      </w:r>
-    </w:p>
-    <w:p>
-      <w:r>
-        <w:t xml:space="preserve">  by default. I fixed it with </w:t>
+        <w:t xml:space="preserve"> My filter drop-downs were empty because imported macros don't see template variables by default. I fixed it with </w:t>
       </w:r>
       <w:r>
         <w:rPr>
@@ -1002,12 +906,7 @@
         <w:t>innerHTML</w:t>
       </w:r>
       <w:r>
-        <w:t xml:space="preserve"> would have been shorter, but it would</w:t>
-      </w:r>
-    </w:p>
-    <w:p>
-      <w:r>
-        <w:t xml:space="preserve">  have let a bad title run as code. I used </w:t>
+        <w:t xml:space="preserve"> would have been shorter, but it would have let a bad title run as code. I used </w:t>
       </w:r>
       <w:r>
         <w:rPr>
@@ -1041,12 +940,7 @@
         <w:pStyle w:val="ListBullet"/>
       </w:pPr>
       <w:r>
-        <w:t>The security tests: I tried SQL injection, XSS, missing CSRF tokens and a normal user on admin pages</w:t>
-      </w:r>
-    </w:p>
-    <w:p>
-      <w:r>
-        <w:t xml:space="preserve">  on my own app, and every attack failed the way it should.</w:t>
+        <w:t>The security tests: I tried SQL injection, XSS, missing CSRF tokens and a normal user on admin pages on my own app, and every attack failed the way it should.</w:t>
       </w:r>
     </w:p>
     <w:p>

</xml_diff>

<commit_message>
Add GitHub link to Word summary
</commit_message>
<xml_diff>
--- a/PROJECT_SUMMARY.docx
+++ b/PROJECT_SUMMARY.docx
@@ -1032,9 +1032,9 @@
       </w:r>
       <w:r>
         <w:rPr>
-          <w:i/>
+          <w:i w:val="0"/>
         </w:rPr>
-        <w:t>(my GitHub link goes here)</w:t>
+        <w:t>https://github.com/sonieja/cybernews</w:t>
       </w:r>
     </w:p>
     <w:p>

</xml_diff>

<commit_message>
Add AI prototype (Lovable) screenshots and honest comparison to the project summary
</commit_message>
<xml_diff>
--- a/PROJECT_SUMMARY.docx
+++ b/PROJECT_SUMMARY.docx
@@ -521,6 +521,15 @@
     </w:p>
     <w:p>
       <w:r>
+        <w:rPr>
+          <w:i/>
+          <w:sz w:val="18"/>
+        </w:rPr>
+        <w:t>Architecture diagram</w:t>
+      </w:r>
+    </w:p>
+    <w:p>
+      <w:r>
         <w:t xml:space="preserve">In simple words: the </w:t>
       </w:r>
       <w:r>
@@ -810,6 +819,835 @@
         <w:pStyle w:val="Heading1"/>
       </w:pPr>
       <w:r>
+        <w:t>My AI prototype vs. my Flask website</w:t>
+      </w:r>
+    </w:p>
+    <w:p>
+      <w:r>
+        <w:t xml:space="preserve">Before building anything, I asked an AI website builder, </w:t>
+      </w:r>
+      <w:r>
+        <w:rPr>
+          <w:b/>
+        </w:rPr>
+        <w:t>Lovable</w:t>
+      </w:r>
+      <w:r>
+        <w:t xml:space="preserve">, to make a CyberNews website. It called it </w:t>
+      </w:r>
+      <w:r>
+        <w:rPr>
+          <w:b/>
+        </w:rPr>
+        <w:t>"CyberNews Pulse"</w:t>
+      </w:r>
+      <w:r>
+        <w:t>. It asked me no questions and made the whole thing in a few minutes.</w:t>
+      </w:r>
+    </w:p>
+    <w:p>
+      <w:pPr>
+        <w:pStyle w:val="ListBullet"/>
+      </w:pPr>
+      <w:r>
+        <w:t>Lovable project: https://lovable.dev/projects/dc6b9d38-b39a-40b0-9679-c08d98ac2cef</w:t>
+      </w:r>
+    </w:p>
+    <w:p>
+      <w:pPr>
+        <w:pStyle w:val="ListBullet"/>
+      </w:pPr>
+      <w:r>
+        <w:t>Preview: https://dc6b9d38-b39a-40b0-9679-c08d98ac2cef.lovableproject.com/</w:t>
+      </w:r>
+    </w:p>
+    <w:p>
+      <w:pPr>
+        <w:pStyle w:val="ListBullet"/>
+      </w:pPr>
+      <w:r>
+        <w:t xml:space="preserve">My 8 screenshots of it: </w:t>
+      </w:r>
+      <w:r>
+        <w:rPr>
+          <w:rFonts w:ascii="Consolas" w:hAnsi="Consolas"/>
+          <w:color w:val="1A7F37"/>
+        </w:rPr>
+        <w:t>ai_prototype/</w:t>
+      </w:r>
+      <w:r>
+        <w:t xml:space="preserve"> folder</w:t>
+      </w:r>
+    </w:p>
+    <w:p>
+      <w:r>
+        <w:drawing>
+          <wp:inline xmlns:a="http://schemas.openxmlformats.org/drawingml/2006/main" xmlns:pic="http://schemas.openxmlformats.org/drawingml/2006/picture">
+            <wp:extent cx="5760720" cy="3341668"/>
+            <wp:docPr id="2" name="Picture 2"/>
+            <wp:cNvGraphicFramePr>
+              <a:graphicFrameLocks noChangeAspect="1"/>
+            </wp:cNvGraphicFramePr>
+            <a:graphic>
+              <a:graphicData uri="http://schemas.openxmlformats.org/drawingml/2006/picture">
+                <pic:pic>
+                  <pic:nvPicPr>
+                    <pic:cNvPr id="0" name="02_home_hero.png"/>
+                    <pic:cNvPicPr/>
+                  </pic:nvPicPr>
+                  <pic:blipFill>
+                    <a:blip r:embed="rId10"/>
+                    <a:stretch>
+                      <a:fillRect/>
+                    </a:stretch>
+                  </pic:blipFill>
+                  <pic:spPr>
+                    <a:xfrm>
+                      <a:off x="0" y="0"/>
+                      <a:ext cx="5760720" cy="3341668"/>
+                    </a:xfrm>
+                    <a:prstGeom prst="rect"/>
+                  </pic:spPr>
+                </pic:pic>
+              </a:graphicData>
+            </a:graphic>
+          </wp:inline>
+        </w:drawing>
+      </w:r>
+    </w:p>
+    <w:p>
+      <w:r>
+        <w:rPr>
+          <w:i/>
+          <w:sz w:val="18"/>
+        </w:rPr>
+        <w:t>AI prototype home page with the big featured story</w:t>
+      </w:r>
+    </w:p>
+    <w:p>
+      <w:pPr>
+        <w:pStyle w:val="Heading2"/>
+      </w:pPr>
+      <w:r>
+        <w:t>What the AI did better</w:t>
+      </w:r>
+    </w:p>
+    <w:p>
+      <w:pPr>
+        <w:pStyle w:val="ListBullet"/>
+      </w:pPr>
+      <w:r>
+        <w:rPr>
+          <w:b/>
+        </w:rPr>
+        <w:t>Looks.</w:t>
+      </w:r>
+      <w:r>
+        <w:t xml:space="preserve"> Honestly, it looks more professional than mine: a dark charcoal background with a grid and a soft glow, headlines that fade from green to yellow, neon green (#22c55e) and yellow (#facc15), and small monospace tags. Funny thing: those are the same two colours I already used in my own style.css.</w:t>
+      </w:r>
+    </w:p>
+    <w:p>
+      <w:pPr>
+        <w:pStyle w:val="ListBullet"/>
+      </w:pPr>
+      <w:r>
+        <w:rPr>
+          <w:b/>
+        </w:rPr>
+        <w:t>Speed.</w:t>
+      </w:r>
+      <w:r>
+        <w:t xml:space="preserve"> A full-looking site in minutes: header and nav, a big featured "top story", 9 article cards, category chips and a search that really filter the cards, a "Trending" sidebar, an article page, a login page called "Access terminal", an admin dashboard with stat cards and an edit/delete table, and a contact form.</w:t>
+      </w:r>
+    </w:p>
+    <w:p>
+      <w:pPr>
+        <w:pStyle w:val="ListBullet"/>
+      </w:pPr>
+      <w:r>
+        <w:rPr>
+          <w:b/>
+        </w:rPr>
+        <w:t>Ideas I can borrow.</w:t>
+      </w:r>
+      <w:r>
+        <w:t xml:space="preserve"> The trending sidebar, category chips instead of a drop-down, and the bookmark icon on each card.</w:t>
+      </w:r>
+    </w:p>
+    <w:p>
+      <w:pPr>
+        <w:pStyle w:val="Heading2"/>
+      </w:pPr>
+      <w:r>
+        <w:t>What my Flask website does that the prototype doesn't</w:t>
+      </w:r>
+    </w:p>
+    <w:tbl>
+      <w:tblPr>
+        <w:tblStyle w:val="LightGrid-Accent1"/>
+        <w:tblW w:type="auto" w:w="0"/>
+        <w:tblLook w:firstColumn="1" w:firstRow="1" w:lastColumn="0" w:lastRow="0" w:noHBand="0" w:noVBand="1" w:val="04A0"/>
+      </w:tblPr>
+      <w:tblGrid>
+        <w:gridCol w:w="2880"/>
+        <w:gridCol w:w="2880"/>
+        <w:gridCol w:w="2880"/>
+      </w:tblGrid>
+      <w:tr>
+        <w:tc>
+          <w:tcPr>
+            <w:tcW w:type="dxa" w:w="2880"/>
+          </w:tcPr>
+          <w:p>
+            <w:r/>
+            <w:r>
+              <w:t>Feature</w:t>
+            </w:r>
+          </w:p>
+        </w:tc>
+        <w:tc>
+          <w:tcPr>
+            <w:tcW w:type="dxa" w:w="2880"/>
+          </w:tcPr>
+          <w:p>
+            <w:r/>
+            <w:r>
+              <w:t>AI prototype (Lovable)</w:t>
+            </w:r>
+          </w:p>
+        </w:tc>
+        <w:tc>
+          <w:tcPr>
+            <w:tcW w:type="dxa" w:w="2880"/>
+          </w:tcPr>
+          <w:p>
+            <w:r/>
+            <w:r>
+              <w:t>My CyberNews (Flask)</w:t>
+            </w:r>
+          </w:p>
+        </w:tc>
+      </w:tr>
+      <w:tr>
+        <w:tc>
+          <w:tcPr>
+            <w:tcW w:type="dxa" w:w="2880"/>
+          </w:tcPr>
+          <w:p>
+            <w:r/>
+            <w:r>
+              <w:t>Where data lives</w:t>
+            </w:r>
+          </w:p>
+        </w:tc>
+        <w:tc>
+          <w:tcPr>
+            <w:tcW w:type="dxa" w:w="2880"/>
+          </w:tcPr>
+          <w:p>
+            <w:r/>
+            <w:r>
+              <w:t>Only in the browser, gone for other users</w:t>
+            </w:r>
+          </w:p>
+        </w:tc>
+        <w:tc>
+          <w:tcPr>
+            <w:tcW w:type="dxa" w:w="2880"/>
+          </w:tcPr>
+          <w:p>
+            <w:r/>
+            <w:r>
+              <w:t>SQLite database on the server</w:t>
+            </w:r>
+          </w:p>
+        </w:tc>
+      </w:tr>
+      <w:tr>
+        <w:tc>
+          <w:tcPr>
+            <w:tcW w:type="dxa" w:w="2880"/>
+          </w:tcPr>
+          <w:p>
+            <w:r/>
+            <w:r>
+              <w:t>Login</w:t>
+            </w:r>
+          </w:p>
+        </w:tc>
+        <w:tc>
+          <w:tcPr>
+            <w:tcW w:type="dxa" w:w="2880"/>
+          </w:tcPr>
+          <w:p>
+            <w:r/>
+            <w:r>
+              <w:t>Did not work in the preview</w:t>
+            </w:r>
+          </w:p>
+        </w:tc>
+        <w:tc>
+          <w:tcPr>
+            <w:tcW w:type="dxa" w:w="2880"/>
+          </w:tcPr>
+          <w:p>
+            <w:r/>
+            <w:r>
+              <w:t>Real login with sessions</w:t>
+            </w:r>
+          </w:p>
+        </w:tc>
+      </w:tr>
+      <w:tr>
+        <w:tc>
+          <w:tcPr>
+            <w:tcW w:type="dxa" w:w="2880"/>
+          </w:tcPr>
+          <w:p>
+            <w:r/>
+            <w:r>
+              <w:t>Passwords</w:t>
+            </w:r>
+          </w:p>
+        </w:tc>
+        <w:tc>
+          <w:tcPr>
+            <w:tcW w:type="dxa" w:w="2880"/>
+          </w:tcPr>
+          <w:p>
+            <w:r/>
+            <w:r>
+              <w:t>Ended up in the address bar</w:t>
+            </w:r>
+          </w:p>
+        </w:tc>
+        <w:tc>
+          <w:tcPr>
+            <w:tcW w:type="dxa" w:w="2880"/>
+          </w:tcPr>
+          <w:p>
+            <w:r/>
+            <w:r>
+              <w:t>Hashed with Werkzeug, never stored or shown</w:t>
+            </w:r>
+          </w:p>
+        </w:tc>
+      </w:tr>
+      <w:tr>
+        <w:tc>
+          <w:tcPr>
+            <w:tcW w:type="dxa" w:w="2880"/>
+          </w:tcPr>
+          <w:p>
+            <w:r/>
+            <w:r>
+              <w:t>Admin page</w:t>
+            </w:r>
+          </w:p>
+        </w:tc>
+        <w:tc>
+          <w:tcPr>
+            <w:tcW w:type="dxa" w:w="2880"/>
+          </w:tcPr>
+          <w:p>
+            <w:r/>
+            <w:r>
+              <w:t xml:space="preserve">Anyone can open </w:t>
+            </w:r>
+            <w:r>
+              <w:rPr>
+                <w:rFonts w:ascii="Consolas" w:hAnsi="Consolas"/>
+                <w:color w:val="1A7F37"/>
+              </w:rPr>
+              <w:t>/admin</w:t>
+            </w:r>
+          </w:p>
+        </w:tc>
+        <w:tc>
+          <w:tcPr>
+            <w:tcW w:type="dxa" w:w="2880"/>
+          </w:tcPr>
+          <w:p>
+            <w:r/>
+            <w:r>
+              <w:rPr>
+                <w:rFonts w:ascii="Consolas" w:hAnsi="Consolas"/>
+                <w:color w:val="1A7F37"/>
+              </w:rPr>
+              <w:t>@admin_required</w:t>
+            </w:r>
+            <w:r>
+              <w:t xml:space="preserve"> → normal users get </w:t>
+            </w:r>
+            <w:r>
+              <w:rPr>
+                <w:b/>
+              </w:rPr>
+              <w:t>403</w:t>
+            </w:r>
+          </w:p>
+        </w:tc>
+      </w:tr>
+      <w:tr>
+        <w:tc>
+          <w:tcPr>
+            <w:tcW w:type="dxa" w:w="2880"/>
+          </w:tcPr>
+          <w:p>
+            <w:r/>
+            <w:r>
+              <w:t>Add / edit / delete</w:t>
+            </w:r>
+          </w:p>
+        </w:tc>
+        <w:tc>
+          <w:tcPr>
+            <w:tcW w:type="dxa" w:w="2880"/>
+          </w:tcPr>
+          <w:p>
+            <w:r/>
+            <w:r>
+              <w:t>Buttons are there (I did not test them)</w:t>
+            </w:r>
+          </w:p>
+        </w:tc>
+        <w:tc>
+          <w:tcPr>
+            <w:tcW w:type="dxa" w:w="2880"/>
+          </w:tcPr>
+          <w:p>
+            <w:r/>
+            <w:r>
+              <w:t>Working, admin only, checked on the server</w:t>
+            </w:r>
+          </w:p>
+        </w:tc>
+      </w:tr>
+      <w:tr>
+        <w:tc>
+          <w:tcPr>
+            <w:tcW w:type="dxa" w:w="2880"/>
+          </w:tcPr>
+          <w:p>
+            <w:r/>
+            <w:r>
+              <w:t>CSRF protection</w:t>
+            </w:r>
+          </w:p>
+        </w:tc>
+        <w:tc>
+          <w:tcPr>
+            <w:tcW w:type="dxa" w:w="2880"/>
+          </w:tcPr>
+          <w:p>
+            <w:r/>
+            <w:r>
+              <w:t>None that I could see</w:t>
+            </w:r>
+          </w:p>
+        </w:tc>
+        <w:tc>
+          <w:tcPr>
+            <w:tcW w:type="dxa" w:w="2880"/>
+          </w:tcPr>
+          <w:p>
+            <w:r/>
+            <w:r>
+              <w:t>Token in every form, missing token → 400</w:t>
+            </w:r>
+          </w:p>
+        </w:tc>
+      </w:tr>
+      <w:tr>
+        <w:tc>
+          <w:tcPr>
+            <w:tcW w:type="dxa" w:w="2880"/>
+          </w:tcPr>
+          <w:p>
+            <w:r/>
+            <w:r>
+              <w:t>Bookmarks</w:t>
+            </w:r>
+          </w:p>
+        </w:tc>
+        <w:tc>
+          <w:tcPr>
+            <w:tcW w:type="dxa" w:w="2880"/>
+          </w:tcPr>
+          <w:p>
+            <w:r/>
+            <w:r>
+              <w:t>Only saved in this browser</w:t>
+            </w:r>
+          </w:p>
+        </w:tc>
+        <w:tc>
+          <w:tcPr>
+            <w:tcW w:type="dxa" w:w="2880"/>
+          </w:tcPr>
+          <w:p>
+            <w:r/>
+            <w:r>
+              <w:t>Saved per user in the database</w:t>
+            </w:r>
+          </w:p>
+        </w:tc>
+      </w:tr>
+      <w:tr>
+        <w:tc>
+          <w:tcPr>
+            <w:tcW w:type="dxa" w:w="2880"/>
+          </w:tcPr>
+          <w:p>
+            <w:r/>
+            <w:r>
+              <w:t>Contact form</w:t>
+            </w:r>
+          </w:p>
+        </w:tc>
+        <w:tc>
+          <w:tcPr>
+            <w:tcW w:type="dxa" w:w="2880"/>
+          </w:tcPr>
+          <w:p>
+            <w:r/>
+            <w:r>
+              <w:t>Sends nothing</w:t>
+            </w:r>
+          </w:p>
+        </w:tc>
+        <w:tc>
+          <w:tcPr>
+            <w:tcW w:type="dxa" w:w="2880"/>
+          </w:tcPr>
+          <w:p>
+            <w:r/>
+            <w:r>
+              <w:t>Saved in the database, shown to the admin</w:t>
+            </w:r>
+          </w:p>
+        </w:tc>
+      </w:tr>
+      <w:tr>
+        <w:tc>
+          <w:tcPr>
+            <w:tcW w:type="dxa" w:w="2880"/>
+          </w:tcPr>
+          <w:p>
+            <w:r/>
+            <w:r>
+              <w:t>Audit log</w:t>
+            </w:r>
+          </w:p>
+        </w:tc>
+        <w:tc>
+          <w:tcPr>
+            <w:tcW w:type="dxa" w:w="2880"/>
+          </w:tcPr>
+          <w:p>
+            <w:r/>
+            <w:r>
+              <w:t>No</w:t>
+            </w:r>
+          </w:p>
+        </w:tc>
+        <w:tc>
+          <w:tcPr>
+            <w:tcW w:type="dxa" w:w="2880"/>
+          </w:tcPr>
+          <w:p>
+            <w:r/>
+            <w:r>
+              <w:t>Every login, failed login and logout</w:t>
+            </w:r>
+          </w:p>
+        </w:tc>
+      </w:tr>
+      <w:tr>
+        <w:tc>
+          <w:tcPr>
+            <w:tcW w:type="dxa" w:w="2880"/>
+          </w:tcPr>
+          <w:p>
+            <w:r/>
+            <w:r>
+              <w:t>Sample articles</w:t>
+            </w:r>
+          </w:p>
+        </w:tc>
+        <w:tc>
+          <w:tcPr>
+            <w:tcW w:type="dxa" w:w="2880"/>
+          </w:tcPr>
+          <w:p>
+            <w:r/>
+            <w:r>
+              <w:t>Look like real news, not labelled</w:t>
+            </w:r>
+          </w:p>
+        </w:tc>
+        <w:tc>
+          <w:tcPr>
+            <w:tcW w:type="dxa" w:w="2880"/>
+          </w:tcPr>
+          <w:p>
+            <w:r/>
+            <w:r>
+              <w:t>Marked "Sample", links only to home pages</w:t>
+            </w:r>
+          </w:p>
+        </w:tc>
+      </w:tr>
+      <w:tr>
+        <w:tc>
+          <w:tcPr>
+            <w:tcW w:type="dxa" w:w="2880"/>
+          </w:tcPr>
+          <w:p>
+            <w:r/>
+            <w:r>
+              <w:t>Tests</w:t>
+            </w:r>
+          </w:p>
+        </w:tc>
+        <w:tc>
+          <w:tcPr>
+            <w:tcW w:type="dxa" w:w="2880"/>
+          </w:tcPr>
+          <w:p>
+            <w:r/>
+            <w:r>
+              <w:t>None</w:t>
+            </w:r>
+          </w:p>
+        </w:tc>
+        <w:tc>
+          <w:tcPr>
+            <w:tcW w:type="dxa" w:w="2880"/>
+          </w:tcPr>
+          <w:p>
+            <w:r/>
+            <w:r>
+              <w:t>19 pytest tests + curl security checks</w:t>
+            </w:r>
+          </w:p>
+        </w:tc>
+      </w:tr>
+    </w:tbl>
+    <w:p>
+      <w:pPr>
+        <w:pStyle w:val="Heading2"/>
+      </w:pPr>
+      <w:r>
+        <w:t>The security lessons I learned from it</w:t>
+      </w:r>
+    </w:p>
+    <w:p>
+      <w:r>
+        <w:drawing>
+          <wp:inline xmlns:a="http://schemas.openxmlformats.org/drawingml/2006/main" xmlns:pic="http://schemas.openxmlformats.org/drawingml/2006/picture">
+            <wp:extent cx="5760720" cy="3341668"/>
+            <wp:docPr id="3" name="Picture 3"/>
+            <wp:cNvGraphicFramePr>
+              <a:graphicFrameLocks noChangeAspect="1"/>
+            </wp:cNvGraphicFramePr>
+            <a:graphic>
+              <a:graphicData uri="http://schemas.openxmlformats.org/drawingml/2006/picture">
+                <pic:pic>
+                  <pic:nvPicPr>
+                    <pic:cNvPr id="0" name="06_login_page.png"/>
+                    <pic:cNvPicPr/>
+                  </pic:nvPicPr>
+                  <pic:blipFill>
+                    <a:blip r:embed="rId11"/>
+                    <a:stretch>
+                      <a:fillRect/>
+                    </a:stretch>
+                  </pic:blipFill>
+                  <pic:spPr>
+                    <a:xfrm>
+                      <a:off x="0" y="0"/>
+                      <a:ext cx="5760720" cy="3341668"/>
+                    </a:xfrm>
+                    <a:prstGeom prst="rect"/>
+                  </pic:spPr>
+                </pic:pic>
+              </a:graphicData>
+            </a:graphic>
+          </wp:inline>
+        </w:drawing>
+      </w:r>
+    </w:p>
+    <w:p>
+      <w:r>
+        <w:rPr>
+          <w:i/>
+          <w:sz w:val="18"/>
+        </w:rPr>
+        <w:t>AI prototype login page</w:t>
+      </w:r>
+    </w:p>
+    <w:p>
+      <w:pPr>
+        <w:pStyle w:val="ListNumber"/>
+      </w:pPr>
+      <w:r>
+        <w:rPr>
+          <w:b/>
+        </w:rPr>
+        <w:t>Password in the URL.</w:t>
+      </w:r>
+      <w:r>
+        <w:t xml:space="preserve"> When I pressed Sign in on the prototype's login page, the page reloaded and my email </w:t>
+      </w:r>
+      <w:r>
+        <w:rPr>
+          <w:b/>
+        </w:rPr>
+        <w:t>and password</w:t>
+      </w:r>
+      <w:r>
+        <w:t xml:space="preserve"> appeared in the address bar (</w:t>
+      </w:r>
+      <w:r>
+        <w:rPr>
+          <w:rFonts w:ascii="Consolas" w:hAnsi="Consolas"/>
+          <w:color w:val="1A7F37"/>
+        </w:rPr>
+        <w:t>?email=...&amp;password=...</w:t>
+      </w:r>
+      <w:r>
+        <w:t xml:space="preserve">). This usually happens when a form has no </w:t>
+      </w:r>
+      <w:r>
+        <w:rPr>
+          <w:rFonts w:ascii="Consolas" w:hAnsi="Consolas"/>
+          <w:color w:val="1A7F37"/>
+        </w:rPr>
+        <w:t>method="POST"</w:t>
+      </w:r>
+      <w:r>
+        <w:t xml:space="preserve"> and nothing handles it, so the browser sends it as GET. A URL is saved in the browser history, in server logs and in proxy logs, and can be seen over someone's shoulder. That's why all my login and register forms use </w:t>
+      </w:r>
+      <w:r>
+        <w:rPr>
+          <w:rFonts w:ascii="Consolas" w:hAnsi="Consolas"/>
+          <w:color w:val="1A7F37"/>
+        </w:rPr>
+        <w:t>method="POST"</w:t>
+      </w:r>
+      <w:r>
+        <w:t>.</w:t>
+      </w:r>
+    </w:p>
+    <w:p>
+      <w:pPr>
+        <w:pStyle w:val="ListNumber"/>
+      </w:pPr>
+      <w:r>
+        <w:rPr>
+          <w:b/>
+        </w:rPr>
+        <w:t>Unguarded admin page.</w:t>
+      </w:r>
+      <w:r>
+        <w:t xml:space="preserve"> I could open the prototype's </w:t>
+      </w:r>
+      <w:r>
+        <w:rPr>
+          <w:rFonts w:ascii="Consolas" w:hAnsi="Consolas"/>
+          <w:color w:val="1A7F37"/>
+        </w:rPr>
+        <w:t>/admin</w:t>
+      </w:r>
+      <w:r>
+        <w:t xml:space="preserve"> without logging in at all (the nav still says "Login" in my screenshot). Hiding a button is not security. My site checks the role </w:t>
+      </w:r>
+      <w:r>
+        <w:rPr>
+          <w:b/>
+        </w:rPr>
+        <w:t>on the server</w:t>
+      </w:r>
+      <w:r>
+        <w:t xml:space="preserve"> for every admin route.</w:t>
+      </w:r>
+    </w:p>
+    <w:p>
+      <w:pPr>
+        <w:pStyle w:val="ListNumber"/>
+      </w:pPr>
+      <w:r>
+        <w:rPr>
+          <w:b/>
+        </w:rPr>
+        <w:t>Pretty is not the same as safe.</w:t>
+      </w:r>
+      <w:r>
+        <w:t xml:space="preserve"> The prototype looks finished, but it has no backend, so nothing a user does is really saved or checked. If I only looked at the screenshots, I could think it was a real product.</w:t>
+      </w:r>
+    </w:p>
+    <w:p>
+      <w:r>
+        <w:drawing>
+          <wp:inline xmlns:a="http://schemas.openxmlformats.org/drawingml/2006/main" xmlns:pic="http://schemas.openxmlformats.org/drawingml/2006/picture">
+            <wp:extent cx="5760720" cy="3341668"/>
+            <wp:docPr id="4" name="Picture 4"/>
+            <wp:cNvGraphicFramePr>
+              <a:graphicFrameLocks noChangeAspect="1"/>
+            </wp:cNvGraphicFramePr>
+            <a:graphic>
+              <a:graphicData uri="http://schemas.openxmlformats.org/drawingml/2006/picture">
+                <pic:pic>
+                  <pic:nvPicPr>
+                    <pic:cNvPr id="0" name="07_admin_dashboard.png"/>
+                    <pic:cNvPicPr/>
+                  </pic:nvPicPr>
+                  <pic:blipFill>
+                    <a:blip r:embed="rId12"/>
+                    <a:stretch>
+                      <a:fillRect/>
+                    </a:stretch>
+                  </pic:blipFill>
+                  <pic:spPr>
+                    <a:xfrm>
+                      <a:off x="0" y="0"/>
+                      <a:ext cx="5760720" cy="3341668"/>
+                    </a:xfrm>
+                    <a:prstGeom prst="rect"/>
+                  </pic:spPr>
+                </pic:pic>
+              </a:graphicData>
+            </a:graphic>
+          </wp:inline>
+        </w:drawing>
+      </w:r>
+    </w:p>
+    <w:p>
+      <w:r>
+        <w:rPr>
+          <w:i/>
+          <w:sz w:val="18"/>
+        </w:rPr>
+        <w:t>AI prototype admin dashboard, opened without logging in</w:t>
+      </w:r>
+    </w:p>
+    <w:p>
+      <w:r>
+        <w:rPr>
+          <w:b/>
+        </w:rPr>
+        <w:t>My conclusion:</w:t>
+      </w:r>
+      <w:r>
+        <w:t xml:space="preserve"> the AI is great for a quick picture of the goal and for design ideas. But I could not explain or trust its security, and the important parts were missing. Building it myself in Flask was slower, but now everything works on a real server, and I can explain and test every line.</w:t>
+      </w:r>
+    </w:p>
+    <w:p>
+      <w:pPr>
+        <w:pStyle w:val="Heading1"/>
+      </w:pPr>
+      <w:r>
         <w:t>What challenged me</w:t>
       </w:r>
     </w:p>
@@ -1028,13 +1866,23 @@
         <w:pStyle w:val="ListBullet"/>
       </w:pPr>
       <w:r>
-        <w:t xml:space="preserve">Project repository: </w:t>
+        <w:t>Project repository: https://github.com/sonieja/cybernews</w:t>
       </w:r>
+    </w:p>
+    <w:p>
+      <w:pPr>
+        <w:pStyle w:val="ListBullet"/>
+      </w:pPr>
       <w:r>
-        <w:rPr>
-          <w:i w:val="0"/>
-        </w:rPr>
-        <w:t>https://github.com/sonieja/cybernews</w:t>
+        <w:t>AI prototype (Lovable "CyberNews Pulse"): https://lovable.dev/projects/dc6b9d38-b39a-40b0-9679-c08d98ac2cef</w:t>
+      </w:r>
+    </w:p>
+    <w:p>
+      <w:pPr>
+        <w:pStyle w:val="ListBullet"/>
+      </w:pPr>
+      <w:r>
+        <w:t>AI prototype preview: https://dc6b9d38-b39a-40b0-9679-c08d98ac2cef.lovableproject.com/</w:t>
       </w:r>
     </w:p>
     <w:p>
@@ -1046,9 +1894,13 @@
       </w:r>
       <w:r>
         <w:rPr>
-          <w:i/>
+          <w:rFonts w:ascii="Consolas" w:hAnsi="Consolas"/>
+          <w:color w:val="1A7F37"/>
         </w:rPr>
-        <w:t>(added separately)</w:t>
+        <w:t>ai_prototype/</w:t>
+      </w:r>
+      <w:r>
+        <w:t xml:space="preserve"> folder (8 pictures)</w:t>
       </w:r>
     </w:p>
     <w:p>

</xml_diff>